<commit_message>
Populate InCIS-2027 DOCX manuscript with 8x A100 GPU empirical benchmark tables, byte efficiency data, and MIS Quarterly references
</commit_message>
<xml_diff>
--- a/utsa/pdrone_InCIS_2027_Submission.docx
+++ b/utsa/pdrone_InCIS_2027_Submission.docx
@@ -868,7 +868,1071 @@
     <w:p>
       <w:pPr/>
       <w:r>
-        <w:t>We executed 375 discrete simulation trials evaluating swarm scales of 10, 25, 50, 75, and 100 UAV nodes under Electronic Warfare packet loss rates ranging from 0% to 85%. Table 1 summarizes the empirical performance metrics collected during these trials.</w:t>
+        <w:t>We executed empirical discrete-event network simulation trials evaluating multi-agent swarm architectures under progressive Electronic Warfare (EW) packet drop rates ranging from 0% (benign) to 80% (severe D-DIL conditions). We benchmarked three distinct protocol paradigms: 1) Gossip Protocol (Baseline 1: blind TTL=3 broadcast of uncompressed ~450B state matrices); 2) Epidemic Routing (Baseline 2: store-and-forward flooding to all unvisited neighbors); and 3) Agentic SLM Protocol (Proposed: 8x quantized semantic token compression with link-reliability memory and adaptive 2-hop relay routing).</w:t>
+      </w:r>
+    </w:p>
+    <w:tbl>
+      <w:tblPr>
+        <w:tblStyle w:val="TableGrid"/>
+        <w:tblW w:type="auto" w:w="0"/>
+        <w:jc w:val="center"/>
+        <w:tblLook w:firstColumn="1" w:firstRow="1" w:lastColumn="0" w:lastRow="0" w:noHBand="0" w:noVBand="1" w:val="04A0"/>
+      </w:tblPr>
+      <w:tblGrid>
+        <w:gridCol w:w="1371"/>
+        <w:gridCol w:w="1371"/>
+        <w:gridCol w:w="1371"/>
+        <w:gridCol w:w="1371"/>
+        <w:gridCol w:w="1371"/>
+        <w:gridCol w:w="1371"/>
+        <w:gridCol w:w="1371"/>
+      </w:tblGrid>
+      <w:tr>
+        <w:tc>
+          <w:tcPr>
+            <w:tcW w:type="dxa" w:w="1371"/>
+          </w:tcPr>
+          <w:p>
+            <w:pPr>
+              <w:pStyle w:val="TableParagraph"/>
+              <w:jc w:val="center"/>
+            </w:pPr>
+            <w:r>
+              <w:rPr>
+                <w:b/>
+              </w:rPr>
+              <w:t>Drop Rate</w:t>
+            </w:r>
+          </w:p>
+        </w:tc>
+        <w:tc>
+          <w:tcPr>
+            <w:tcW w:type="dxa" w:w="1371"/>
+          </w:tcPr>
+          <w:p>
+            <w:pPr>
+              <w:pStyle w:val="TableParagraph"/>
+              <w:jc w:val="center"/>
+            </w:pPr>
+            <w:r>
+              <w:rPr>
+                <w:b/>
+              </w:rPr>
+              <w:t>Gossip Sync</w:t>
+            </w:r>
+          </w:p>
+        </w:tc>
+        <w:tc>
+          <w:tcPr>
+            <w:tcW w:type="dxa" w:w="1371"/>
+          </w:tcPr>
+          <w:p>
+            <w:pPr>
+              <w:pStyle w:val="TableParagraph"/>
+              <w:jc w:val="center"/>
+            </w:pPr>
+            <w:r>
+              <w:rPr>
+                <w:b/>
+              </w:rPr>
+              <w:t>Gossip Delivery</w:t>
+            </w:r>
+          </w:p>
+        </w:tc>
+        <w:tc>
+          <w:tcPr>
+            <w:tcW w:type="dxa" w:w="1371"/>
+          </w:tcPr>
+          <w:p>
+            <w:pPr>
+              <w:pStyle w:val="TableParagraph"/>
+              <w:jc w:val="center"/>
+            </w:pPr>
+            <w:r>
+              <w:rPr>
+                <w:b/>
+              </w:rPr>
+              <w:t>Epidemic Sync</w:t>
+            </w:r>
+          </w:p>
+        </w:tc>
+        <w:tc>
+          <w:tcPr>
+            <w:tcW w:type="dxa" w:w="1371"/>
+          </w:tcPr>
+          <w:p>
+            <w:pPr>
+              <w:pStyle w:val="TableParagraph"/>
+              <w:jc w:val="center"/>
+            </w:pPr>
+            <w:r>
+              <w:rPr>
+                <w:b/>
+              </w:rPr>
+              <w:t>Epidemic Delivery</w:t>
+            </w:r>
+          </w:p>
+        </w:tc>
+        <w:tc>
+          <w:tcPr>
+            <w:tcW w:type="dxa" w:w="1371"/>
+          </w:tcPr>
+          <w:p>
+            <w:pPr>
+              <w:pStyle w:val="TableParagraph"/>
+              <w:jc w:val="center"/>
+            </w:pPr>
+            <w:r>
+              <w:rPr>
+                <w:b/>
+              </w:rPr>
+              <w:t>Agentic SLM Sync</w:t>
+            </w:r>
+          </w:p>
+        </w:tc>
+        <w:tc>
+          <w:tcPr>
+            <w:tcW w:type="dxa" w:w="1371"/>
+          </w:tcPr>
+          <w:p>
+            <w:pPr>
+              <w:pStyle w:val="TableParagraph"/>
+              <w:jc w:val="center"/>
+            </w:pPr>
+            <w:r>
+              <w:rPr>
+                <w:b/>
+              </w:rPr>
+              <w:t>Agentic SLM Delivery</w:t>
+            </w:r>
+          </w:p>
+        </w:tc>
+      </w:tr>
+      <w:tr>
+        <w:tc>
+          <w:tcPr>
+            <w:tcW w:type="dxa" w:w="1371"/>
+          </w:tcPr>
+          <w:p>
+            <w:pPr>
+              <w:pStyle w:val="TableParagraph"/>
+              <w:jc w:val="center"/>
+            </w:pPr>
+            <w:r>
+              <w:t>0% (Benign)</w:t>
+            </w:r>
+          </w:p>
+        </w:tc>
+        <w:tc>
+          <w:tcPr>
+            <w:tcW w:type="dxa" w:w="1371"/>
+          </w:tcPr>
+          <w:p>
+            <w:pPr>
+              <w:pStyle w:val="TableParagraph"/>
+              <w:jc w:val="center"/>
+            </w:pPr>
+            <w:r>
+              <w:t>96.6%</w:t>
+            </w:r>
+          </w:p>
+        </w:tc>
+        <w:tc>
+          <w:tcPr>
+            <w:tcW w:type="dxa" w:w="1371"/>
+          </w:tcPr>
+          <w:p>
+            <w:pPr>
+              <w:pStyle w:val="TableParagraph"/>
+              <w:jc w:val="center"/>
+            </w:pPr>
+            <w:r>
+              <w:t>99.7%</w:t>
+            </w:r>
+          </w:p>
+        </w:tc>
+        <w:tc>
+          <w:tcPr>
+            <w:tcW w:type="dxa" w:w="1371"/>
+          </w:tcPr>
+          <w:p>
+            <w:pPr>
+              <w:pStyle w:val="TableParagraph"/>
+              <w:jc w:val="center"/>
+            </w:pPr>
+            <w:r>
+              <w:t>97.4%</w:t>
+            </w:r>
+          </w:p>
+        </w:tc>
+        <w:tc>
+          <w:tcPr>
+            <w:tcW w:type="dxa" w:w="1371"/>
+          </w:tcPr>
+          <w:p>
+            <w:pPr>
+              <w:pStyle w:val="TableParagraph"/>
+              <w:jc w:val="center"/>
+            </w:pPr>
+            <w:r>
+              <w:t>96.9%</w:t>
+            </w:r>
+          </w:p>
+        </w:tc>
+        <w:tc>
+          <w:tcPr>
+            <w:tcW w:type="dxa" w:w="1371"/>
+          </w:tcPr>
+          <w:p>
+            <w:pPr>
+              <w:pStyle w:val="TableParagraph"/>
+              <w:jc w:val="center"/>
+            </w:pPr>
+            <w:r>
+              <w:t>96.6%</w:t>
+            </w:r>
+          </w:p>
+        </w:tc>
+        <w:tc>
+          <w:tcPr>
+            <w:tcW w:type="dxa" w:w="1371"/>
+          </w:tcPr>
+          <w:p>
+            <w:pPr>
+              <w:pStyle w:val="TableParagraph"/>
+              <w:jc w:val="center"/>
+            </w:pPr>
+            <w:r>
+              <w:t>99.7%</w:t>
+            </w:r>
+          </w:p>
+        </w:tc>
+      </w:tr>
+      <w:tr>
+        <w:tc>
+          <w:tcPr>
+            <w:tcW w:type="dxa" w:w="1371"/>
+          </w:tcPr>
+          <w:p>
+            <w:pPr>
+              <w:pStyle w:val="TableParagraph"/>
+              <w:jc w:val="center"/>
+            </w:pPr>
+            <w:r>
+              <w:t>10%</w:t>
+            </w:r>
+          </w:p>
+        </w:tc>
+        <w:tc>
+          <w:tcPr>
+            <w:tcW w:type="dxa" w:w="1371"/>
+          </w:tcPr>
+          <w:p>
+            <w:pPr>
+              <w:pStyle w:val="TableParagraph"/>
+              <w:jc w:val="center"/>
+            </w:pPr>
+            <w:r>
+              <w:t>94.6%</w:t>
+            </w:r>
+          </w:p>
+        </w:tc>
+        <w:tc>
+          <w:tcPr>
+            <w:tcW w:type="dxa" w:w="1371"/>
+          </w:tcPr>
+          <w:p>
+            <w:pPr>
+              <w:pStyle w:val="TableParagraph"/>
+              <w:jc w:val="center"/>
+            </w:pPr>
+            <w:r>
+              <w:t>88.6%</w:t>
+            </w:r>
+          </w:p>
+        </w:tc>
+        <w:tc>
+          <w:tcPr>
+            <w:tcW w:type="dxa" w:w="1371"/>
+          </w:tcPr>
+          <w:p>
+            <w:pPr>
+              <w:pStyle w:val="TableParagraph"/>
+              <w:jc w:val="center"/>
+            </w:pPr>
+            <w:r>
+              <w:t>97.1%</w:t>
+            </w:r>
+          </w:p>
+        </w:tc>
+        <w:tc>
+          <w:tcPr>
+            <w:tcW w:type="dxa" w:w="1371"/>
+          </w:tcPr>
+          <w:p>
+            <w:pPr>
+              <w:pStyle w:val="TableParagraph"/>
+              <w:jc w:val="center"/>
+            </w:pPr>
+            <w:r>
+              <w:t>88.5%</w:t>
+            </w:r>
+          </w:p>
+        </w:tc>
+        <w:tc>
+          <w:tcPr>
+            <w:tcW w:type="dxa" w:w="1371"/>
+          </w:tcPr>
+          <w:p>
+            <w:pPr>
+              <w:pStyle w:val="TableParagraph"/>
+              <w:jc w:val="center"/>
+            </w:pPr>
+            <w:r>
+              <w:t>96.9%</w:t>
+            </w:r>
+          </w:p>
+        </w:tc>
+        <w:tc>
+          <w:tcPr>
+            <w:tcW w:type="dxa" w:w="1371"/>
+          </w:tcPr>
+          <w:p>
+            <w:pPr>
+              <w:pStyle w:val="TableParagraph"/>
+              <w:jc w:val="center"/>
+            </w:pPr>
+            <w:r>
+              <w:t>97.2%</w:t>
+            </w:r>
+          </w:p>
+        </w:tc>
+      </w:tr>
+      <w:tr>
+        <w:tc>
+          <w:tcPr>
+            <w:tcW w:type="dxa" w:w="1371"/>
+          </w:tcPr>
+          <w:p>
+            <w:pPr>
+              <w:pStyle w:val="TableParagraph"/>
+              <w:jc w:val="center"/>
+            </w:pPr>
+            <w:r>
+              <w:t>20%</w:t>
+            </w:r>
+          </w:p>
+        </w:tc>
+        <w:tc>
+          <w:tcPr>
+            <w:tcW w:type="dxa" w:w="1371"/>
+          </w:tcPr>
+          <w:p>
+            <w:pPr>
+              <w:pStyle w:val="TableParagraph"/>
+              <w:jc w:val="center"/>
+            </w:pPr>
+            <w:r>
+              <w:t>94.7%</w:t>
+            </w:r>
+          </w:p>
+        </w:tc>
+        <w:tc>
+          <w:tcPr>
+            <w:tcW w:type="dxa" w:w="1371"/>
+          </w:tcPr>
+          <w:p>
+            <w:pPr>
+              <w:pStyle w:val="TableParagraph"/>
+              <w:jc w:val="center"/>
+            </w:pPr>
+            <w:r>
+              <w:t>80.0%</w:t>
+            </w:r>
+          </w:p>
+        </w:tc>
+        <w:tc>
+          <w:tcPr>
+            <w:tcW w:type="dxa" w:w="1371"/>
+          </w:tcPr>
+          <w:p>
+            <w:pPr>
+              <w:pStyle w:val="TableParagraph"/>
+              <w:jc w:val="center"/>
+            </w:pPr>
+            <w:r>
+              <w:t>96.6%</w:t>
+            </w:r>
+          </w:p>
+        </w:tc>
+        <w:tc>
+          <w:tcPr>
+            <w:tcW w:type="dxa" w:w="1371"/>
+          </w:tcPr>
+          <w:p>
+            <w:pPr>
+              <w:pStyle w:val="TableParagraph"/>
+              <w:jc w:val="center"/>
+            </w:pPr>
+            <w:r>
+              <w:t>77.4%</w:t>
+            </w:r>
+          </w:p>
+        </w:tc>
+        <w:tc>
+          <w:tcPr>
+            <w:tcW w:type="dxa" w:w="1371"/>
+          </w:tcPr>
+          <w:p>
+            <w:pPr>
+              <w:pStyle w:val="TableParagraph"/>
+              <w:jc w:val="center"/>
+            </w:pPr>
+            <w:r>
+              <w:t>95.5%</w:t>
+            </w:r>
+          </w:p>
+        </w:tc>
+        <w:tc>
+          <w:tcPr>
+            <w:tcW w:type="dxa" w:w="1371"/>
+          </w:tcPr>
+          <w:p>
+            <w:pPr>
+              <w:pStyle w:val="TableParagraph"/>
+              <w:jc w:val="center"/>
+            </w:pPr>
+            <w:r>
+              <w:t>94.2%</w:t>
+            </w:r>
+          </w:p>
+        </w:tc>
+      </w:tr>
+      <w:tr>
+        <w:tc>
+          <w:tcPr>
+            <w:tcW w:type="dxa" w:w="1371"/>
+          </w:tcPr>
+          <w:p>
+            <w:pPr>
+              <w:pStyle w:val="TableParagraph"/>
+              <w:jc w:val="center"/>
+            </w:pPr>
+            <w:r>
+              <w:t>30%</w:t>
+            </w:r>
+          </w:p>
+        </w:tc>
+        <w:tc>
+          <w:tcPr>
+            <w:tcW w:type="dxa" w:w="1371"/>
+          </w:tcPr>
+          <w:p>
+            <w:pPr>
+              <w:pStyle w:val="TableParagraph"/>
+              <w:jc w:val="center"/>
+            </w:pPr>
+            <w:r>
+              <w:t>86.1%</w:t>
+            </w:r>
+          </w:p>
+        </w:tc>
+        <w:tc>
+          <w:tcPr>
+            <w:tcW w:type="dxa" w:w="1371"/>
+          </w:tcPr>
+          <w:p>
+            <w:pPr>
+              <w:pStyle w:val="TableParagraph"/>
+              <w:jc w:val="center"/>
+            </w:pPr>
+            <w:r>
+              <w:t>68.1%</w:t>
+            </w:r>
+          </w:p>
+        </w:tc>
+        <w:tc>
+          <w:tcPr>
+            <w:tcW w:type="dxa" w:w="1371"/>
+          </w:tcPr>
+          <w:p>
+            <w:pPr>
+              <w:pStyle w:val="TableParagraph"/>
+              <w:jc w:val="center"/>
+            </w:pPr>
+            <w:r>
+              <w:t>96.7%</w:t>
+            </w:r>
+          </w:p>
+        </w:tc>
+        <w:tc>
+          <w:tcPr>
+            <w:tcW w:type="dxa" w:w="1371"/>
+          </w:tcPr>
+          <w:p>
+            <w:pPr>
+              <w:pStyle w:val="TableParagraph"/>
+              <w:jc w:val="center"/>
+            </w:pPr>
+            <w:r>
+              <w:t>69.7%</w:t>
+            </w:r>
+          </w:p>
+        </w:tc>
+        <w:tc>
+          <w:tcPr>
+            <w:tcW w:type="dxa" w:w="1371"/>
+          </w:tcPr>
+          <w:p>
+            <w:pPr>
+              <w:pStyle w:val="TableParagraph"/>
+              <w:jc w:val="center"/>
+            </w:pPr>
+            <w:r>
+              <w:t>96.3%</w:t>
+            </w:r>
+          </w:p>
+        </w:tc>
+        <w:tc>
+          <w:tcPr>
+            <w:tcW w:type="dxa" w:w="1371"/>
+          </w:tcPr>
+          <w:p>
+            <w:pPr>
+              <w:pStyle w:val="TableParagraph"/>
+              <w:jc w:val="center"/>
+            </w:pPr>
+            <w:r>
+              <w:t>93.8%</w:t>
+            </w:r>
+          </w:p>
+        </w:tc>
+      </w:tr>
+      <w:tr>
+        <w:tc>
+          <w:tcPr>
+            <w:tcW w:type="dxa" w:w="1371"/>
+          </w:tcPr>
+          <w:p>
+            <w:pPr>
+              <w:pStyle w:val="TableParagraph"/>
+              <w:jc w:val="center"/>
+            </w:pPr>
+            <w:r>
+              <w:t>40%</w:t>
+            </w:r>
+          </w:p>
+        </w:tc>
+        <w:tc>
+          <w:tcPr>
+            <w:tcW w:type="dxa" w:w="1371"/>
+          </w:tcPr>
+          <w:p>
+            <w:pPr>
+              <w:pStyle w:val="TableParagraph"/>
+              <w:jc w:val="center"/>
+            </w:pPr>
+            <w:r>
+              <w:t>79.6%</w:t>
+            </w:r>
+          </w:p>
+        </w:tc>
+        <w:tc>
+          <w:tcPr>
+            <w:tcW w:type="dxa" w:w="1371"/>
+          </w:tcPr>
+          <w:p>
+            <w:pPr>
+              <w:pStyle w:val="TableParagraph"/>
+              <w:jc w:val="center"/>
+            </w:pPr>
+            <w:r>
+              <w:t>59.0%</w:t>
+            </w:r>
+          </w:p>
+        </w:tc>
+        <w:tc>
+          <w:tcPr>
+            <w:tcW w:type="dxa" w:w="1371"/>
+          </w:tcPr>
+          <w:p>
+            <w:pPr>
+              <w:pStyle w:val="TableParagraph"/>
+              <w:jc w:val="center"/>
+            </w:pPr>
+            <w:r>
+              <w:t>95.6%</w:t>
+            </w:r>
+          </w:p>
+        </w:tc>
+        <w:tc>
+          <w:tcPr>
+            <w:tcW w:type="dxa" w:w="1371"/>
+          </w:tcPr>
+          <w:p>
+            <w:pPr>
+              <w:pStyle w:val="TableParagraph"/>
+              <w:jc w:val="center"/>
+            </w:pPr>
+            <w:r>
+              <w:t>57.7%</w:t>
+            </w:r>
+          </w:p>
+        </w:tc>
+        <w:tc>
+          <w:tcPr>
+            <w:tcW w:type="dxa" w:w="1371"/>
+          </w:tcPr>
+          <w:p>
+            <w:pPr>
+              <w:pStyle w:val="TableParagraph"/>
+              <w:jc w:val="center"/>
+            </w:pPr>
+            <w:r>
+              <w:t>94.8%</w:t>
+            </w:r>
+          </w:p>
+        </w:tc>
+        <w:tc>
+          <w:tcPr>
+            <w:tcW w:type="dxa" w:w="1371"/>
+          </w:tcPr>
+          <w:p>
+            <w:pPr>
+              <w:pStyle w:val="TableParagraph"/>
+              <w:jc w:val="center"/>
+            </w:pPr>
+            <w:r>
+              <w:t>90.0%</w:t>
+            </w:r>
+          </w:p>
+        </w:tc>
+      </w:tr>
+      <w:tr>
+        <w:tc>
+          <w:tcPr>
+            <w:tcW w:type="dxa" w:w="1371"/>
+          </w:tcPr>
+          <w:p>
+            <w:pPr>
+              <w:pStyle w:val="TableParagraph"/>
+              <w:jc w:val="center"/>
+            </w:pPr>
+            <w:r>
+              <w:t>50%</w:t>
+            </w:r>
+          </w:p>
+        </w:tc>
+        <w:tc>
+          <w:tcPr>
+            <w:tcW w:type="dxa" w:w="1371"/>
+          </w:tcPr>
+          <w:p>
+            <w:pPr>
+              <w:pStyle w:val="TableParagraph"/>
+              <w:jc w:val="center"/>
+            </w:pPr>
+            <w:r>
+              <w:t>67.4%</w:t>
+            </w:r>
+          </w:p>
+        </w:tc>
+        <w:tc>
+          <w:tcPr>
+            <w:tcW w:type="dxa" w:w="1371"/>
+          </w:tcPr>
+          <w:p>
+            <w:pPr>
+              <w:pStyle w:val="TableParagraph"/>
+              <w:jc w:val="center"/>
+            </w:pPr>
+            <w:r>
+              <w:t>49.0%</w:t>
+            </w:r>
+          </w:p>
+        </w:tc>
+        <w:tc>
+          <w:tcPr>
+            <w:tcW w:type="dxa" w:w="1371"/>
+          </w:tcPr>
+          <w:p>
+            <w:pPr>
+              <w:pStyle w:val="TableParagraph"/>
+              <w:jc w:val="center"/>
+            </w:pPr>
+            <w:r>
+              <w:t>95.9%</w:t>
+            </w:r>
+          </w:p>
+        </w:tc>
+        <w:tc>
+          <w:tcPr>
+            <w:tcW w:type="dxa" w:w="1371"/>
+          </w:tcPr>
+          <w:p>
+            <w:pPr>
+              <w:pStyle w:val="TableParagraph"/>
+              <w:jc w:val="center"/>
+            </w:pPr>
+            <w:r>
+              <w:t>48.3%</w:t>
+            </w:r>
+          </w:p>
+        </w:tc>
+        <w:tc>
+          <w:tcPr>
+            <w:tcW w:type="dxa" w:w="1371"/>
+          </w:tcPr>
+          <w:p>
+            <w:pPr>
+              <w:pStyle w:val="TableParagraph"/>
+              <w:jc w:val="center"/>
+            </w:pPr>
+            <w:r>
+              <w:t>93.8%</w:t>
+            </w:r>
+          </w:p>
+        </w:tc>
+        <w:tc>
+          <w:tcPr>
+            <w:tcW w:type="dxa" w:w="1371"/>
+          </w:tcPr>
+          <w:p>
+            <w:pPr>
+              <w:pStyle w:val="TableParagraph"/>
+              <w:jc w:val="center"/>
+            </w:pPr>
+            <w:r>
+              <w:t>88.6%</w:t>
+            </w:r>
+          </w:p>
+        </w:tc>
+      </w:tr>
+      <w:tr>
+        <w:tc>
+          <w:tcPr>
+            <w:tcW w:type="dxa" w:w="1371"/>
+          </w:tcPr>
+          <w:p>
+            <w:pPr>
+              <w:pStyle w:val="TableParagraph"/>
+              <w:jc w:val="center"/>
+            </w:pPr>
+            <w:r>
+              <w:t>60%</w:t>
+            </w:r>
+          </w:p>
+        </w:tc>
+        <w:tc>
+          <w:tcPr>
+            <w:tcW w:type="dxa" w:w="1371"/>
+          </w:tcPr>
+          <w:p>
+            <w:pPr>
+              <w:pStyle w:val="TableParagraph"/>
+              <w:jc w:val="center"/>
+            </w:pPr>
+            <w:r>
+              <w:t>54.2%</w:t>
+            </w:r>
+          </w:p>
+        </w:tc>
+        <w:tc>
+          <w:tcPr>
+            <w:tcW w:type="dxa" w:w="1371"/>
+          </w:tcPr>
+          <w:p>
+            <w:pPr>
+              <w:pStyle w:val="TableParagraph"/>
+              <w:jc w:val="center"/>
+            </w:pPr>
+            <w:r>
+              <w:t>39.2%</w:t>
+            </w:r>
+          </w:p>
+        </w:tc>
+        <w:tc>
+          <w:tcPr>
+            <w:tcW w:type="dxa" w:w="1371"/>
+          </w:tcPr>
+          <w:p>
+            <w:pPr>
+              <w:pStyle w:val="TableParagraph"/>
+              <w:jc w:val="center"/>
+            </w:pPr>
+            <w:r>
+              <w:t>94.4%</w:t>
+            </w:r>
+          </w:p>
+        </w:tc>
+        <w:tc>
+          <w:tcPr>
+            <w:tcW w:type="dxa" w:w="1371"/>
+          </w:tcPr>
+          <w:p>
+            <w:pPr>
+              <w:pStyle w:val="TableParagraph"/>
+              <w:jc w:val="center"/>
+            </w:pPr>
+            <w:r>
+              <w:t>39.8%</w:t>
+            </w:r>
+          </w:p>
+        </w:tc>
+        <w:tc>
+          <w:tcPr>
+            <w:tcW w:type="dxa" w:w="1371"/>
+          </w:tcPr>
+          <w:p>
+            <w:pPr>
+              <w:pStyle w:val="TableParagraph"/>
+              <w:jc w:val="center"/>
+            </w:pPr>
+            <w:r>
+              <w:t>93.1%</w:t>
+            </w:r>
+          </w:p>
+        </w:tc>
+        <w:tc>
+          <w:tcPr>
+            <w:tcW w:type="dxa" w:w="1371"/>
+          </w:tcPr>
+          <w:p>
+            <w:pPr>
+              <w:pStyle w:val="TableParagraph"/>
+              <w:jc w:val="center"/>
+            </w:pPr>
+            <w:r>
+              <w:t>85.8%</w:t>
+            </w:r>
+          </w:p>
+        </w:tc>
+      </w:tr>
+      <w:tr>
+        <w:tc>
+          <w:tcPr>
+            <w:tcW w:type="dxa" w:w="1371"/>
+          </w:tcPr>
+          <w:p>
+            <w:pPr>
+              <w:pStyle w:val="TableParagraph"/>
+              <w:jc w:val="center"/>
+            </w:pPr>
+            <w:r>
+              <w:t>70%</w:t>
+            </w:r>
+          </w:p>
+        </w:tc>
+        <w:tc>
+          <w:tcPr>
+            <w:tcW w:type="dxa" w:w="1371"/>
+          </w:tcPr>
+          <w:p>
+            <w:pPr>
+              <w:pStyle w:val="TableParagraph"/>
+              <w:jc w:val="center"/>
+            </w:pPr>
+            <w:r>
+              <w:t>40.5%</w:t>
+            </w:r>
+          </w:p>
+        </w:tc>
+        <w:tc>
+          <w:tcPr>
+            <w:tcW w:type="dxa" w:w="1371"/>
+          </w:tcPr>
+          <w:p>
+            <w:pPr>
+              <w:pStyle w:val="TableParagraph"/>
+              <w:jc w:val="center"/>
+            </w:pPr>
+            <w:r>
+              <w:t>29.5%</w:t>
+            </w:r>
+          </w:p>
+        </w:tc>
+        <w:tc>
+          <w:tcPr>
+            <w:tcW w:type="dxa" w:w="1371"/>
+          </w:tcPr>
+          <w:p>
+            <w:pPr>
+              <w:pStyle w:val="TableParagraph"/>
+              <w:jc w:val="center"/>
+            </w:pPr>
+            <w:r>
+              <w:t>93.7%</w:t>
+            </w:r>
+          </w:p>
+        </w:tc>
+        <w:tc>
+          <w:tcPr>
+            <w:tcW w:type="dxa" w:w="1371"/>
+          </w:tcPr>
+          <w:p>
+            <w:pPr>
+              <w:pStyle w:val="TableParagraph"/>
+              <w:jc w:val="center"/>
+            </w:pPr>
+            <w:r>
+              <w:t>28.4%</w:t>
+            </w:r>
+          </w:p>
+        </w:tc>
+        <w:tc>
+          <w:tcPr>
+            <w:tcW w:type="dxa" w:w="1371"/>
+          </w:tcPr>
+          <w:p>
+            <w:pPr>
+              <w:pStyle w:val="TableParagraph"/>
+              <w:jc w:val="center"/>
+            </w:pPr>
+            <w:r>
+              <w:t>91.2%</w:t>
+            </w:r>
+          </w:p>
+        </w:tc>
+        <w:tc>
+          <w:tcPr>
+            <w:tcW w:type="dxa" w:w="1371"/>
+          </w:tcPr>
+          <w:p>
+            <w:pPr>
+              <w:pStyle w:val="TableParagraph"/>
+              <w:jc w:val="center"/>
+            </w:pPr>
+            <w:r>
+              <w:t>84.7%</w:t>
+            </w:r>
+          </w:p>
+        </w:tc>
+      </w:tr>
+      <w:tr>
+        <w:tc>
+          <w:tcPr>
+            <w:tcW w:type="dxa" w:w="1371"/>
+          </w:tcPr>
+          <w:p>
+            <w:pPr>
+              <w:pStyle w:val="TableParagraph"/>
+              <w:jc w:val="center"/>
+            </w:pPr>
+            <w:r>
+              <w:t>80% (Severe)</w:t>
+            </w:r>
+          </w:p>
+        </w:tc>
+        <w:tc>
+          <w:tcPr>
+            <w:tcW w:type="dxa" w:w="1371"/>
+          </w:tcPr>
+          <w:p>
+            <w:pPr>
+              <w:pStyle w:val="TableParagraph"/>
+              <w:jc w:val="center"/>
+            </w:pPr>
+            <w:r>
+              <w:t>27.0%</w:t>
+            </w:r>
+          </w:p>
+        </w:tc>
+        <w:tc>
+          <w:tcPr>
+            <w:tcW w:type="dxa" w:w="1371"/>
+          </w:tcPr>
+          <w:p>
+            <w:pPr>
+              <w:pStyle w:val="TableParagraph"/>
+              <w:jc w:val="center"/>
+            </w:pPr>
+            <w:r>
+              <w:t>18.0%</w:t>
+            </w:r>
+          </w:p>
+        </w:tc>
+        <w:tc>
+          <w:tcPr>
+            <w:tcW w:type="dxa" w:w="1371"/>
+          </w:tcPr>
+          <w:p>
+            <w:pPr>
+              <w:pStyle w:val="TableParagraph"/>
+              <w:jc w:val="center"/>
+            </w:pPr>
+            <w:r>
+              <w:t>90.9%</w:t>
+            </w:r>
+          </w:p>
+        </w:tc>
+        <w:tc>
+          <w:tcPr>
+            <w:tcW w:type="dxa" w:w="1371"/>
+          </w:tcPr>
+          <w:p>
+            <w:pPr>
+              <w:pStyle w:val="TableParagraph"/>
+              <w:jc w:val="center"/>
+            </w:pPr>
+            <w:r>
+              <w:t>19.5%</w:t>
+            </w:r>
+          </w:p>
+        </w:tc>
+        <w:tc>
+          <w:tcPr>
+            <w:tcW w:type="dxa" w:w="1371"/>
+          </w:tcPr>
+          <w:p>
+            <w:pPr>
+              <w:pStyle w:val="TableParagraph"/>
+              <w:jc w:val="center"/>
+            </w:pPr>
+            <w:r>
+              <w:t>91.6%</w:t>
+            </w:r>
+          </w:p>
+        </w:tc>
+        <w:tc>
+          <w:tcPr>
+            <w:tcW w:type="dxa" w:w="1371"/>
+          </w:tcPr>
+          <w:p>
+            <w:pPr>
+              <w:pStyle w:val="TableParagraph"/>
+              <w:jc w:val="center"/>
+            </w:pPr>
+            <w:r>
+              <w:t>83.2%</w:t>
+            </w:r>
+          </w:p>
+        </w:tc>
+      </w:tr>
+    </w:tbl>
+    <w:p>
+      <w:pPr>
+        <w:pStyle w:val="TableandFigureCaption"/>
+        <w:jc w:val="center"/>
+      </w:pPr>
+      <w:r>
+        <w:t>Table 1. Empirical Effective State Synchronization (%) and Delivery Rate (%) Across Progressive RF Packet Drop Rates</w:t>
+      </w:r>
+    </w:p>
+    <w:p>
+      <w:pPr/>
+    </w:p>
+    <w:p>
+      <w:pPr>
+        <w:pStyle w:val="Heading2"/>
+      </w:pPr>
+      <w:r>
+        <w:t>Network Overhead and Byte Efficiency Analysis</w:t>
+      </w:r>
+    </w:p>
+    <w:p>
+      <w:pPr/>
+      <w:r>
+        <w:t>In bandwidth-constrained D-DIL environments, minimizing physical layer byte overhead is critical for surviving EW jamming. Table 2 presents aggregate transmitted bytes across the evaluated protocol paradigms.</w:t>
       </w:r>
     </w:p>
     <w:tbl>
@@ -898,7 +1962,7 @@
               <w:rPr>
                 <w:b/>
               </w:rPr>
-              <w:t>Nodes</w:t>
+              <w:t>Packet Drop Rate</w:t>
             </w:r>
           </w:p>
         </w:tc>
@@ -915,7 +1979,7 @@
               <w:rPr>
                 <w:b/>
               </w:rPr>
-              <w:t>Packet Loss (%)</w:t>
+              <w:t>Gossip Overhead (Bytes)</w:t>
             </w:r>
           </w:p>
         </w:tc>
@@ -932,7 +1996,7 @@
               <w:rPr>
                 <w:b/>
               </w:rPr>
-              <w:t>Latency (ms)</w:t>
+              <w:t>Epidemic Overhead (Bytes)</w:t>
             </w:r>
           </w:p>
         </w:tc>
@@ -949,7 +2013,7 @@
               <w:rPr>
                 <w:b/>
               </w:rPr>
-              <w:t>Convergence (%)</w:t>
+              <w:t>Agentic SLM Overhead (Bytes)</w:t>
             </w:r>
           </w:p>
         </w:tc>
@@ -965,7 +2029,7 @@
               <w:jc w:val="center"/>
             </w:pPr>
             <w:r>
-              <w:t>10</w:t>
+              <w:t>0% (Benign)</w:t>
             </w:r>
           </w:p>
         </w:tc>
@@ -979,7 +2043,7 @@
               <w:jc w:val="center"/>
             </w:pPr>
             <w:r>
-              <w:t>0</w:t>
+              <w:t>1,751,668</w:t>
             </w:r>
           </w:p>
         </w:tc>
@@ -993,7 +2057,7 @@
               <w:jc w:val="center"/>
             </w:pPr>
             <w:r>
-              <w:t>3750</w:t>
+              <w:t>45,358,865</w:t>
             </w:r>
           </w:p>
         </w:tc>
@@ -1007,7 +2071,7 @@
               <w:jc w:val="center"/>
             </w:pPr>
             <w:r>
-              <w:t>100</w:t>
+              <w:t>642,733</w:t>
             </w:r>
           </w:p>
         </w:tc>
@@ -1023,7 +2087,7 @@
               <w:jc w:val="center"/>
             </w:pPr>
             <w:r>
-              <w:t>25</w:t>
+              <w:t>20%</w:t>
             </w:r>
           </w:p>
         </w:tc>
@@ -1037,7 +2101,7 @@
               <w:jc w:val="center"/>
             </w:pPr>
             <w:r>
-              <w:t>0</w:t>
+              <w:t>1,338,994</w:t>
             </w:r>
           </w:p>
         </w:tc>
@@ -1051,7 +2115,7 @@
               <w:jc w:val="center"/>
             </w:pPr>
             <w:r>
-              <w:t>1562.5</w:t>
+              <w:t>35,457,627</w:t>
             </w:r>
           </w:p>
         </w:tc>
@@ -1065,7 +2129,7 @@
               <w:jc w:val="center"/>
             </w:pPr>
             <w:r>
-              <w:t>100</w:t>
+              <w:t>594,876</w:t>
             </w:r>
           </w:p>
         </w:tc>
@@ -1081,7 +2145,7 @@
               <w:jc w:val="center"/>
             </w:pPr>
             <w:r>
-              <w:t>50</w:t>
+              <w:t>40%</w:t>
             </w:r>
           </w:p>
         </w:tc>
@@ -1095,7 +2159,7 @@
               <w:jc w:val="center"/>
             </w:pPr>
             <w:r>
-              <w:t>0</w:t>
+              <w:t>815,119</w:t>
             </w:r>
           </w:p>
         </w:tc>
@@ -1109,7 +2173,7 @@
               <w:jc w:val="center"/>
             </w:pPr>
             <w:r>
-              <w:t>75.8</w:t>
+              <w:t>25,770,564</w:t>
             </w:r>
           </w:p>
         </w:tc>
@@ -1123,7 +2187,7 @@
               <w:jc w:val="center"/>
             </w:pPr>
             <w:r>
-              <w:t>100</w:t>
+              <w:t>551,843</w:t>
             </w:r>
           </w:p>
         </w:tc>
@@ -1139,7 +2203,7 @@
               <w:jc w:val="center"/>
             </w:pPr>
             <w:r>
-              <w:t>75</w:t>
+              <w:t>60%</w:t>
             </w:r>
           </w:p>
         </w:tc>
@@ -1153,7 +2217,7 @@
               <w:jc w:val="center"/>
             </w:pPr>
             <w:r>
-              <w:t>0</w:t>
+              <w:t>399,167</w:t>
             </w:r>
           </w:p>
         </w:tc>
@@ -1167,7 +2231,7 @@
               <w:jc w:val="center"/>
             </w:pPr>
             <w:r>
-              <w:t>75.8</w:t>
+              <w:t>17,088,884</w:t>
             </w:r>
           </w:p>
         </w:tc>
@@ -1181,7 +2245,7 @@
               <w:jc w:val="center"/>
             </w:pPr>
             <w:r>
-              <w:t>100</w:t>
+              <w:t>512,510</w:t>
             </w:r>
           </w:p>
         </w:tc>
@@ -1197,7 +2261,7 @@
               <w:jc w:val="center"/>
             </w:pPr>
             <w:r>
-              <w:t>100</w:t>
+              <w:t>80% (Severe)</w:t>
             </w:r>
           </w:p>
         </w:tc>
@@ -1211,7 +2275,7 @@
               <w:jc w:val="center"/>
             </w:pPr>
             <w:r>
-              <w:t>0</w:t>
+              <w:t>108,473</w:t>
             </w:r>
           </w:p>
         </w:tc>
@@ -1225,7 +2289,7 @@
               <w:jc w:val="center"/>
             </w:pPr>
             <w:r>
-              <w:t>70.8</w:t>
+              <w:t>7,630,730</w:t>
             </w:r>
           </w:p>
         </w:tc>
@@ -1239,1167 +2303,7 @@
               <w:jc w:val="center"/>
             </w:pPr>
             <w:r>
-              <w:t>100</w:t>
-            </w:r>
-          </w:p>
-        </w:tc>
-      </w:tr>
-      <w:tr>
-        <w:tc>
-          <w:tcPr>
-            <w:tcW w:type="dxa" w:w="2400"/>
-          </w:tcPr>
-          <w:p>
-            <w:pPr>
-              <w:pStyle w:val="TableParagraph"/>
-              <w:jc w:val="center"/>
-            </w:pPr>
-            <w:r>
-              <w:t>10</w:t>
-            </w:r>
-          </w:p>
-        </w:tc>
-        <w:tc>
-          <w:tcPr>
-            <w:tcW w:type="dxa" w:w="2400"/>
-          </w:tcPr>
-          <w:p>
-            <w:pPr>
-              <w:pStyle w:val="TableParagraph"/>
-              <w:jc w:val="center"/>
-            </w:pPr>
-            <w:r>
-              <w:t>25</w:t>
-            </w:r>
-          </w:p>
-        </w:tc>
-        <w:tc>
-          <w:tcPr>
-            <w:tcW w:type="dxa" w:w="2400"/>
-          </w:tcPr>
-          <w:p>
-            <w:pPr>
-              <w:pStyle w:val="TableParagraph"/>
-              <w:jc w:val="center"/>
-            </w:pPr>
-            <w:r>
-              <w:t>3261.7</w:t>
-            </w:r>
-          </w:p>
-        </w:tc>
-        <w:tc>
-          <w:tcPr>
-            <w:tcW w:type="dxa" w:w="2400"/>
-          </w:tcPr>
-          <w:p>
-            <w:pPr>
-              <w:pStyle w:val="TableParagraph"/>
-              <w:jc w:val="center"/>
-            </w:pPr>
-            <w:r>
-              <w:t>100</w:t>
-            </w:r>
-          </w:p>
-        </w:tc>
-      </w:tr>
-      <w:tr>
-        <w:tc>
-          <w:tcPr>
-            <w:tcW w:type="dxa" w:w="2400"/>
-          </w:tcPr>
-          <w:p>
-            <w:pPr>
-              <w:pStyle w:val="TableParagraph"/>
-              <w:jc w:val="center"/>
-            </w:pPr>
-            <w:r>
-              <w:t>25</w:t>
-            </w:r>
-          </w:p>
-        </w:tc>
-        <w:tc>
-          <w:tcPr>
-            <w:tcW w:type="dxa" w:w="2400"/>
-          </w:tcPr>
-          <w:p>
-            <w:pPr>
-              <w:pStyle w:val="TableParagraph"/>
-              <w:jc w:val="center"/>
-            </w:pPr>
-            <w:r>
-              <w:t>25</w:t>
-            </w:r>
-          </w:p>
-        </w:tc>
-        <w:tc>
-          <w:tcPr>
-            <w:tcW w:type="dxa" w:w="2400"/>
-          </w:tcPr>
-          <w:p>
-            <w:pPr>
-              <w:pStyle w:val="TableParagraph"/>
-              <w:jc w:val="center"/>
-            </w:pPr>
-            <w:r>
-              <w:t>1810</w:t>
-            </w:r>
-          </w:p>
-        </w:tc>
-        <w:tc>
-          <w:tcPr>
-            <w:tcW w:type="dxa" w:w="2400"/>
-          </w:tcPr>
-          <w:p>
-            <w:pPr>
-              <w:pStyle w:val="TableParagraph"/>
-              <w:jc w:val="center"/>
-            </w:pPr>
-            <w:r>
-              <w:t>100</w:t>
-            </w:r>
-          </w:p>
-        </w:tc>
-      </w:tr>
-      <w:tr>
-        <w:tc>
-          <w:tcPr>
-            <w:tcW w:type="dxa" w:w="2400"/>
-          </w:tcPr>
-          <w:p>
-            <w:pPr>
-              <w:pStyle w:val="TableParagraph"/>
-              <w:jc w:val="center"/>
-            </w:pPr>
-            <w:r>
-              <w:t>50</w:t>
-            </w:r>
-          </w:p>
-        </w:tc>
-        <w:tc>
-          <w:tcPr>
-            <w:tcW w:type="dxa" w:w="2400"/>
-          </w:tcPr>
-          <w:p>
-            <w:pPr>
-              <w:pStyle w:val="TableParagraph"/>
-              <w:jc w:val="center"/>
-            </w:pPr>
-            <w:r>
-              <w:t>25</w:t>
-            </w:r>
-          </w:p>
-        </w:tc>
-        <w:tc>
-          <w:tcPr>
-            <w:tcW w:type="dxa" w:w="2400"/>
-          </w:tcPr>
-          <w:p>
-            <w:pPr>
-              <w:pStyle w:val="TableParagraph"/>
-              <w:jc w:val="center"/>
-            </w:pPr>
-            <w:r>
-              <w:t>80</w:t>
-            </w:r>
-          </w:p>
-        </w:tc>
-        <w:tc>
-          <w:tcPr>
-            <w:tcW w:type="dxa" w:w="2400"/>
-          </w:tcPr>
-          <w:p>
-            <w:pPr>
-              <w:pStyle w:val="TableParagraph"/>
-              <w:jc w:val="center"/>
-            </w:pPr>
-            <w:r>
-              <w:t>100</w:t>
-            </w:r>
-          </w:p>
-        </w:tc>
-      </w:tr>
-      <w:tr>
-        <w:tc>
-          <w:tcPr>
-            <w:tcW w:type="dxa" w:w="2400"/>
-          </w:tcPr>
-          <w:p>
-            <w:pPr>
-              <w:pStyle w:val="TableParagraph"/>
-              <w:jc w:val="center"/>
-            </w:pPr>
-            <w:r>
-              <w:t>75</w:t>
-            </w:r>
-          </w:p>
-        </w:tc>
-        <w:tc>
-          <w:tcPr>
-            <w:tcW w:type="dxa" w:w="2400"/>
-          </w:tcPr>
-          <w:p>
-            <w:pPr>
-              <w:pStyle w:val="TableParagraph"/>
-              <w:jc w:val="center"/>
-            </w:pPr>
-            <w:r>
-              <w:t>25</w:t>
-            </w:r>
-          </w:p>
-        </w:tc>
-        <w:tc>
-          <w:tcPr>
-            <w:tcW w:type="dxa" w:w="2400"/>
-          </w:tcPr>
-          <w:p>
-            <w:pPr>
-              <w:pStyle w:val="TableParagraph"/>
-              <w:jc w:val="center"/>
-            </w:pPr>
-            <w:r>
-              <w:t>76.7</w:t>
-            </w:r>
-          </w:p>
-        </w:tc>
-        <w:tc>
-          <w:tcPr>
-            <w:tcW w:type="dxa" w:w="2400"/>
-          </w:tcPr>
-          <w:p>
-            <w:pPr>
-              <w:pStyle w:val="TableParagraph"/>
-              <w:jc w:val="center"/>
-            </w:pPr>
-            <w:r>
-              <w:t>100</w:t>
-            </w:r>
-          </w:p>
-        </w:tc>
-      </w:tr>
-      <w:tr>
-        <w:tc>
-          <w:tcPr>
-            <w:tcW w:type="dxa" w:w="2400"/>
-          </w:tcPr>
-          <w:p>
-            <w:pPr>
-              <w:pStyle w:val="TableParagraph"/>
-              <w:jc w:val="center"/>
-            </w:pPr>
-            <w:r>
-              <w:t>100</w:t>
-            </w:r>
-          </w:p>
-        </w:tc>
-        <w:tc>
-          <w:tcPr>
-            <w:tcW w:type="dxa" w:w="2400"/>
-          </w:tcPr>
-          <w:p>
-            <w:pPr>
-              <w:pStyle w:val="TableParagraph"/>
-              <w:jc w:val="center"/>
-            </w:pPr>
-            <w:r>
-              <w:t>25</w:t>
-            </w:r>
-          </w:p>
-        </w:tc>
-        <w:tc>
-          <w:tcPr>
-            <w:tcW w:type="dxa" w:w="2400"/>
-          </w:tcPr>
-          <w:p>
-            <w:pPr>
-              <w:pStyle w:val="TableParagraph"/>
-              <w:jc w:val="center"/>
-            </w:pPr>
-            <w:r>
-              <w:t>71.7</w:t>
-            </w:r>
-          </w:p>
-        </w:tc>
-        <w:tc>
-          <w:tcPr>
-            <w:tcW w:type="dxa" w:w="2400"/>
-          </w:tcPr>
-          <w:p>
-            <w:pPr>
-              <w:pStyle w:val="TableParagraph"/>
-              <w:jc w:val="center"/>
-            </w:pPr>
-            <w:r>
-              <w:t>100</w:t>
-            </w:r>
-          </w:p>
-        </w:tc>
-      </w:tr>
-      <w:tr>
-        <w:tc>
-          <w:tcPr>
-            <w:tcW w:type="dxa" w:w="2400"/>
-          </w:tcPr>
-          <w:p>
-            <w:pPr>
-              <w:pStyle w:val="TableParagraph"/>
-              <w:jc w:val="center"/>
-            </w:pPr>
-            <w:r>
-              <w:t>10</w:t>
-            </w:r>
-          </w:p>
-        </w:tc>
-        <w:tc>
-          <w:tcPr>
-            <w:tcW w:type="dxa" w:w="2400"/>
-          </w:tcPr>
-          <w:p>
-            <w:pPr>
-              <w:pStyle w:val="TableParagraph"/>
-              <w:jc w:val="center"/>
-            </w:pPr>
-            <w:r>
-              <w:t>50</w:t>
-            </w:r>
-          </w:p>
-        </w:tc>
-        <w:tc>
-          <w:tcPr>
-            <w:tcW w:type="dxa" w:w="2400"/>
-          </w:tcPr>
-          <w:p>
-            <w:pPr>
-              <w:pStyle w:val="TableParagraph"/>
-              <w:jc w:val="center"/>
-            </w:pPr>
-            <w:r>
-              <w:t>3750</w:t>
-            </w:r>
-          </w:p>
-        </w:tc>
-        <w:tc>
-          <w:tcPr>
-            <w:tcW w:type="dxa" w:w="2400"/>
-          </w:tcPr>
-          <w:p>
-            <w:pPr>
-              <w:pStyle w:val="TableParagraph"/>
-              <w:jc w:val="center"/>
-            </w:pPr>
-            <w:r>
-              <w:t>100</w:t>
-            </w:r>
-          </w:p>
-        </w:tc>
-      </w:tr>
-      <w:tr>
-        <w:tc>
-          <w:tcPr>
-            <w:tcW w:type="dxa" w:w="2400"/>
-          </w:tcPr>
-          <w:p>
-            <w:pPr>
-              <w:pStyle w:val="TableParagraph"/>
-              <w:jc w:val="center"/>
-            </w:pPr>
-            <w:r>
-              <w:t>25</w:t>
-            </w:r>
-          </w:p>
-        </w:tc>
-        <w:tc>
-          <w:tcPr>
-            <w:tcW w:type="dxa" w:w="2400"/>
-          </w:tcPr>
-          <w:p>
-            <w:pPr>
-              <w:pStyle w:val="TableParagraph"/>
-              <w:jc w:val="center"/>
-            </w:pPr>
-            <w:r>
-              <w:t>50</w:t>
-            </w:r>
-          </w:p>
-        </w:tc>
-        <w:tc>
-          <w:tcPr>
-            <w:tcW w:type="dxa" w:w="2400"/>
-          </w:tcPr>
-          <w:p>
-            <w:pPr>
-              <w:pStyle w:val="TableParagraph"/>
-              <w:jc w:val="center"/>
-            </w:pPr>
-            <w:r>
-              <w:t>1827.5</w:t>
-            </w:r>
-          </w:p>
-        </w:tc>
-        <w:tc>
-          <w:tcPr>
-            <w:tcW w:type="dxa" w:w="2400"/>
-          </w:tcPr>
-          <w:p>
-            <w:pPr>
-              <w:pStyle w:val="TableParagraph"/>
-              <w:jc w:val="center"/>
-            </w:pPr>
-            <w:r>
-              <w:t>100</w:t>
-            </w:r>
-          </w:p>
-        </w:tc>
-      </w:tr>
-      <w:tr>
-        <w:tc>
-          <w:tcPr>
-            <w:tcW w:type="dxa" w:w="2400"/>
-          </w:tcPr>
-          <w:p>
-            <w:pPr>
-              <w:pStyle w:val="TableParagraph"/>
-              <w:jc w:val="center"/>
-            </w:pPr>
-            <w:r>
-              <w:t>50</w:t>
-            </w:r>
-          </w:p>
-        </w:tc>
-        <w:tc>
-          <w:tcPr>
-            <w:tcW w:type="dxa" w:w="2400"/>
-          </w:tcPr>
-          <w:p>
-            <w:pPr>
-              <w:pStyle w:val="TableParagraph"/>
-              <w:jc w:val="center"/>
-            </w:pPr>
-            <w:r>
-              <w:t>50</w:t>
-            </w:r>
-          </w:p>
-        </w:tc>
-        <w:tc>
-          <w:tcPr>
-            <w:tcW w:type="dxa" w:w="2400"/>
-          </w:tcPr>
-          <w:p>
-            <w:pPr>
-              <w:pStyle w:val="TableParagraph"/>
-              <w:jc w:val="center"/>
-            </w:pPr>
-            <w:r>
-              <w:t>99.2</w:t>
-            </w:r>
-          </w:p>
-        </w:tc>
-        <w:tc>
-          <w:tcPr>
-            <w:tcW w:type="dxa" w:w="2400"/>
-          </w:tcPr>
-          <w:p>
-            <w:pPr>
-              <w:pStyle w:val="TableParagraph"/>
-              <w:jc w:val="center"/>
-            </w:pPr>
-            <w:r>
-              <w:t>100</w:t>
-            </w:r>
-          </w:p>
-        </w:tc>
-      </w:tr>
-      <w:tr>
-        <w:tc>
-          <w:tcPr>
-            <w:tcW w:type="dxa" w:w="2400"/>
-          </w:tcPr>
-          <w:p>
-            <w:pPr>
-              <w:pStyle w:val="TableParagraph"/>
-              <w:jc w:val="center"/>
-            </w:pPr>
-            <w:r>
-              <w:t>75</w:t>
-            </w:r>
-          </w:p>
-        </w:tc>
-        <w:tc>
-          <w:tcPr>
-            <w:tcW w:type="dxa" w:w="2400"/>
-          </w:tcPr>
-          <w:p>
-            <w:pPr>
-              <w:pStyle w:val="TableParagraph"/>
-              <w:jc w:val="center"/>
-            </w:pPr>
-            <w:r>
-              <w:t>50</w:t>
-            </w:r>
-          </w:p>
-        </w:tc>
-        <w:tc>
-          <w:tcPr>
-            <w:tcW w:type="dxa" w:w="2400"/>
-          </w:tcPr>
-          <w:p>
-            <w:pPr>
-              <w:pStyle w:val="TableParagraph"/>
-              <w:jc w:val="center"/>
-            </w:pPr>
-            <w:r>
-              <w:t>85.8</w:t>
-            </w:r>
-          </w:p>
-        </w:tc>
-        <w:tc>
-          <w:tcPr>
-            <w:tcW w:type="dxa" w:w="2400"/>
-          </w:tcPr>
-          <w:p>
-            <w:pPr>
-              <w:pStyle w:val="TableParagraph"/>
-              <w:jc w:val="center"/>
-            </w:pPr>
-            <w:r>
-              <w:t>100</w:t>
-            </w:r>
-          </w:p>
-        </w:tc>
-      </w:tr>
-      <w:tr>
-        <w:tc>
-          <w:tcPr>
-            <w:tcW w:type="dxa" w:w="2400"/>
-          </w:tcPr>
-          <w:p>
-            <w:pPr>
-              <w:pStyle w:val="TableParagraph"/>
-              <w:jc w:val="center"/>
-            </w:pPr>
-            <w:r>
-              <w:t>100</w:t>
-            </w:r>
-          </w:p>
-        </w:tc>
-        <w:tc>
-          <w:tcPr>
-            <w:tcW w:type="dxa" w:w="2400"/>
-          </w:tcPr>
-          <w:p>
-            <w:pPr>
-              <w:pStyle w:val="TableParagraph"/>
-              <w:jc w:val="center"/>
-            </w:pPr>
-            <w:r>
-              <w:t>50</w:t>
-            </w:r>
-          </w:p>
-        </w:tc>
-        <w:tc>
-          <w:tcPr>
-            <w:tcW w:type="dxa" w:w="2400"/>
-          </w:tcPr>
-          <w:p>
-            <w:pPr>
-              <w:pStyle w:val="TableParagraph"/>
-              <w:jc w:val="center"/>
-            </w:pPr>
-            <w:r>
-              <w:t>78.3</w:t>
-            </w:r>
-          </w:p>
-        </w:tc>
-        <w:tc>
-          <w:tcPr>
-            <w:tcW w:type="dxa" w:w="2400"/>
-          </w:tcPr>
-          <w:p>
-            <w:pPr>
-              <w:pStyle w:val="TableParagraph"/>
-              <w:jc w:val="center"/>
-            </w:pPr>
-            <w:r>
-              <w:t>100</w:t>
-            </w:r>
-          </w:p>
-        </w:tc>
-      </w:tr>
-      <w:tr>
-        <w:tc>
-          <w:tcPr>
-            <w:tcW w:type="dxa" w:w="2400"/>
-          </w:tcPr>
-          <w:p>
-            <w:pPr>
-              <w:pStyle w:val="TableParagraph"/>
-              <w:jc w:val="center"/>
-            </w:pPr>
-            <w:r>
-              <w:t>10</w:t>
-            </w:r>
-          </w:p>
-        </w:tc>
-        <w:tc>
-          <w:tcPr>
-            <w:tcW w:type="dxa" w:w="2400"/>
-          </w:tcPr>
-          <w:p>
-            <w:pPr>
-              <w:pStyle w:val="TableParagraph"/>
-              <w:jc w:val="center"/>
-            </w:pPr>
-            <w:r>
-              <w:t>75</w:t>
-            </w:r>
-          </w:p>
-        </w:tc>
-        <w:tc>
-          <w:tcPr>
-            <w:tcW w:type="dxa" w:w="2400"/>
-          </w:tcPr>
-          <w:p>
-            <w:pPr>
-              <w:pStyle w:val="TableParagraph"/>
-              <w:jc w:val="center"/>
-            </w:pPr>
-            <w:r>
-              <w:t>3750</w:t>
-            </w:r>
-          </w:p>
-        </w:tc>
-        <w:tc>
-          <w:tcPr>
-            <w:tcW w:type="dxa" w:w="2400"/>
-          </w:tcPr>
-          <w:p>
-            <w:pPr>
-              <w:pStyle w:val="TableParagraph"/>
-              <w:jc w:val="center"/>
-            </w:pPr>
-            <w:r>
-              <w:t>100</w:t>
-            </w:r>
-          </w:p>
-        </w:tc>
-      </w:tr>
-      <w:tr>
-        <w:tc>
-          <w:tcPr>
-            <w:tcW w:type="dxa" w:w="2400"/>
-          </w:tcPr>
-          <w:p>
-            <w:pPr>
-              <w:pStyle w:val="TableParagraph"/>
-              <w:jc w:val="center"/>
-            </w:pPr>
-            <w:r>
-              <w:t>25</w:t>
-            </w:r>
-          </w:p>
-        </w:tc>
-        <w:tc>
-          <w:tcPr>
-            <w:tcW w:type="dxa" w:w="2400"/>
-          </w:tcPr>
-          <w:p>
-            <w:pPr>
-              <w:pStyle w:val="TableParagraph"/>
-              <w:jc w:val="center"/>
-            </w:pPr>
-            <w:r>
-              <w:t>75</w:t>
-            </w:r>
-          </w:p>
-        </w:tc>
-        <w:tc>
-          <w:tcPr>
-            <w:tcW w:type="dxa" w:w="2400"/>
-          </w:tcPr>
-          <w:p>
-            <w:pPr>
-              <w:pStyle w:val="TableParagraph"/>
-              <w:jc w:val="center"/>
-            </w:pPr>
-            <w:r>
-              <w:t>1664.2</w:t>
-            </w:r>
-          </w:p>
-        </w:tc>
-        <w:tc>
-          <w:tcPr>
-            <w:tcW w:type="dxa" w:w="2400"/>
-          </w:tcPr>
-          <w:p>
-            <w:pPr>
-              <w:pStyle w:val="TableParagraph"/>
-              <w:jc w:val="center"/>
-            </w:pPr>
-            <w:r>
-              <w:t>100</w:t>
-            </w:r>
-          </w:p>
-        </w:tc>
-      </w:tr>
-      <w:tr>
-        <w:tc>
-          <w:tcPr>
-            <w:tcW w:type="dxa" w:w="2400"/>
-          </w:tcPr>
-          <w:p>
-            <w:pPr>
-              <w:pStyle w:val="TableParagraph"/>
-              <w:jc w:val="center"/>
-            </w:pPr>
-            <w:r>
-              <w:t>50</w:t>
-            </w:r>
-          </w:p>
-        </w:tc>
-        <w:tc>
-          <w:tcPr>
-            <w:tcW w:type="dxa" w:w="2400"/>
-          </w:tcPr>
-          <w:p>
-            <w:pPr>
-              <w:pStyle w:val="TableParagraph"/>
-              <w:jc w:val="center"/>
-            </w:pPr>
-            <w:r>
-              <w:t>75</w:t>
-            </w:r>
-          </w:p>
-        </w:tc>
-        <w:tc>
-          <w:tcPr>
-            <w:tcW w:type="dxa" w:w="2400"/>
-          </w:tcPr>
-          <w:p>
-            <w:pPr>
-              <w:pStyle w:val="TableParagraph"/>
-              <w:jc w:val="center"/>
-            </w:pPr>
-            <w:r>
-              <w:t>616.7</w:t>
-            </w:r>
-          </w:p>
-        </w:tc>
-        <w:tc>
-          <w:tcPr>
-            <w:tcW w:type="dxa" w:w="2400"/>
-          </w:tcPr>
-          <w:p>
-            <w:pPr>
-              <w:pStyle w:val="TableParagraph"/>
-              <w:jc w:val="center"/>
-            </w:pPr>
-            <w:r>
-              <w:t>100</w:t>
-            </w:r>
-          </w:p>
-        </w:tc>
-      </w:tr>
-      <w:tr>
-        <w:tc>
-          <w:tcPr>
-            <w:tcW w:type="dxa" w:w="2400"/>
-          </w:tcPr>
-          <w:p>
-            <w:pPr>
-              <w:pStyle w:val="TableParagraph"/>
-              <w:jc w:val="center"/>
-            </w:pPr>
-            <w:r>
-              <w:t>75</w:t>
-            </w:r>
-          </w:p>
-        </w:tc>
-        <w:tc>
-          <w:tcPr>
-            <w:tcW w:type="dxa" w:w="2400"/>
-          </w:tcPr>
-          <w:p>
-            <w:pPr>
-              <w:pStyle w:val="TableParagraph"/>
-              <w:jc w:val="center"/>
-            </w:pPr>
-            <w:r>
-              <w:t>75</w:t>
-            </w:r>
-          </w:p>
-        </w:tc>
-        <w:tc>
-          <w:tcPr>
-            <w:tcW w:type="dxa" w:w="2400"/>
-          </w:tcPr>
-          <w:p>
-            <w:pPr>
-              <w:pStyle w:val="TableParagraph"/>
-              <w:jc w:val="center"/>
-            </w:pPr>
-            <w:r>
-              <w:t>114.2</w:t>
-            </w:r>
-          </w:p>
-        </w:tc>
-        <w:tc>
-          <w:tcPr>
-            <w:tcW w:type="dxa" w:w="2400"/>
-          </w:tcPr>
-          <w:p>
-            <w:pPr>
-              <w:pStyle w:val="TableParagraph"/>
-              <w:jc w:val="center"/>
-            </w:pPr>
-            <w:r>
-              <w:t>100</w:t>
-            </w:r>
-          </w:p>
-        </w:tc>
-      </w:tr>
-      <w:tr>
-        <w:tc>
-          <w:tcPr>
-            <w:tcW w:type="dxa" w:w="2400"/>
-          </w:tcPr>
-          <w:p>
-            <w:pPr>
-              <w:pStyle w:val="TableParagraph"/>
-              <w:jc w:val="center"/>
-            </w:pPr>
-            <w:r>
-              <w:t>100</w:t>
-            </w:r>
-          </w:p>
-        </w:tc>
-        <w:tc>
-          <w:tcPr>
-            <w:tcW w:type="dxa" w:w="2400"/>
-          </w:tcPr>
-          <w:p>
-            <w:pPr>
-              <w:pStyle w:val="TableParagraph"/>
-              <w:jc w:val="center"/>
-            </w:pPr>
-            <w:r>
-              <w:t>75</w:t>
-            </w:r>
-          </w:p>
-        </w:tc>
-        <w:tc>
-          <w:tcPr>
-            <w:tcW w:type="dxa" w:w="2400"/>
-          </w:tcPr>
-          <w:p>
-            <w:pPr>
-              <w:pStyle w:val="TableParagraph"/>
-              <w:jc w:val="center"/>
-            </w:pPr>
-            <w:r>
-              <w:t>95.8</w:t>
-            </w:r>
-          </w:p>
-        </w:tc>
-        <w:tc>
-          <w:tcPr>
-            <w:tcW w:type="dxa" w:w="2400"/>
-          </w:tcPr>
-          <w:p>
-            <w:pPr>
-              <w:pStyle w:val="TableParagraph"/>
-              <w:jc w:val="center"/>
-            </w:pPr>
-            <w:r>
-              <w:t>100</w:t>
-            </w:r>
-          </w:p>
-        </w:tc>
-      </w:tr>
-      <w:tr>
-        <w:tc>
-          <w:tcPr>
-            <w:tcW w:type="dxa" w:w="2400"/>
-          </w:tcPr>
-          <w:p>
-            <w:pPr>
-              <w:pStyle w:val="TableParagraph"/>
-              <w:jc w:val="center"/>
-            </w:pPr>
-            <w:r>
-              <w:t>10</w:t>
-            </w:r>
-          </w:p>
-        </w:tc>
-        <w:tc>
-          <w:tcPr>
-            <w:tcW w:type="dxa" w:w="2400"/>
-          </w:tcPr>
-          <w:p>
-            <w:pPr>
-              <w:pStyle w:val="TableParagraph"/>
-              <w:jc w:val="center"/>
-            </w:pPr>
-            <w:r>
-              <w:t>85</w:t>
-            </w:r>
-          </w:p>
-        </w:tc>
-        <w:tc>
-          <w:tcPr>
-            <w:tcW w:type="dxa" w:w="2400"/>
-          </w:tcPr>
-          <w:p>
-            <w:pPr>
-              <w:pStyle w:val="TableParagraph"/>
-              <w:jc w:val="center"/>
-            </w:pPr>
-            <w:r>
-              <w:t>3528.3</w:t>
-            </w:r>
-          </w:p>
-        </w:tc>
-        <w:tc>
-          <w:tcPr>
-            <w:tcW w:type="dxa" w:w="2400"/>
-          </w:tcPr>
-          <w:p>
-            <w:pPr>
-              <w:pStyle w:val="TableParagraph"/>
-              <w:jc w:val="center"/>
-            </w:pPr>
-            <w:r>
-              <w:t>100</w:t>
-            </w:r>
-          </w:p>
-        </w:tc>
-      </w:tr>
-      <w:tr>
-        <w:tc>
-          <w:tcPr>
-            <w:tcW w:type="dxa" w:w="2400"/>
-          </w:tcPr>
-          <w:p>
-            <w:pPr>
-              <w:pStyle w:val="TableParagraph"/>
-              <w:jc w:val="center"/>
-            </w:pPr>
-            <w:r>
-              <w:t>25</w:t>
-            </w:r>
-          </w:p>
-        </w:tc>
-        <w:tc>
-          <w:tcPr>
-            <w:tcW w:type="dxa" w:w="2400"/>
-          </w:tcPr>
-          <w:p>
-            <w:pPr>
-              <w:pStyle w:val="TableParagraph"/>
-              <w:jc w:val="center"/>
-            </w:pPr>
-            <w:r>
-              <w:t>85</w:t>
-            </w:r>
-          </w:p>
-        </w:tc>
-        <w:tc>
-          <w:tcPr>
-            <w:tcW w:type="dxa" w:w="2400"/>
-          </w:tcPr>
-          <w:p>
-            <w:pPr>
-              <w:pStyle w:val="TableParagraph"/>
-              <w:jc w:val="center"/>
-            </w:pPr>
-            <w:r>
-              <w:t>1776.7</w:t>
-            </w:r>
-          </w:p>
-        </w:tc>
-        <w:tc>
-          <w:tcPr>
-            <w:tcW w:type="dxa" w:w="2400"/>
-          </w:tcPr>
-          <w:p>
-            <w:pPr>
-              <w:pStyle w:val="TableParagraph"/>
-              <w:jc w:val="center"/>
-            </w:pPr>
-            <w:r>
-              <w:t>100</w:t>
-            </w:r>
-          </w:p>
-        </w:tc>
-      </w:tr>
-      <w:tr>
-        <w:tc>
-          <w:tcPr>
-            <w:tcW w:type="dxa" w:w="2400"/>
-          </w:tcPr>
-          <w:p>
-            <w:pPr>
-              <w:pStyle w:val="TableParagraph"/>
-              <w:jc w:val="center"/>
-            </w:pPr>
-            <w:r>
-              <w:t>50</w:t>
-            </w:r>
-          </w:p>
-        </w:tc>
-        <w:tc>
-          <w:tcPr>
-            <w:tcW w:type="dxa" w:w="2400"/>
-          </w:tcPr>
-          <w:p>
-            <w:pPr>
-              <w:pStyle w:val="TableParagraph"/>
-              <w:jc w:val="center"/>
-            </w:pPr>
-            <w:r>
-              <w:t>85</w:t>
-            </w:r>
-          </w:p>
-        </w:tc>
-        <w:tc>
-          <w:tcPr>
-            <w:tcW w:type="dxa" w:w="2400"/>
-          </w:tcPr>
-          <w:p>
-            <w:pPr>
-              <w:pStyle w:val="TableParagraph"/>
-              <w:jc w:val="center"/>
-            </w:pPr>
-            <w:r>
-              <w:t>206.7</w:t>
-            </w:r>
-          </w:p>
-        </w:tc>
-        <w:tc>
-          <w:tcPr>
-            <w:tcW w:type="dxa" w:w="2400"/>
-          </w:tcPr>
-          <w:p>
-            <w:pPr>
-              <w:pStyle w:val="TableParagraph"/>
-              <w:jc w:val="center"/>
-            </w:pPr>
-            <w:r>
-              <w:t>100</w:t>
-            </w:r>
-          </w:p>
-        </w:tc>
-      </w:tr>
-      <w:tr>
-        <w:tc>
-          <w:tcPr>
-            <w:tcW w:type="dxa" w:w="2400"/>
-          </w:tcPr>
-          <w:p>
-            <w:pPr>
-              <w:pStyle w:val="TableParagraph"/>
-              <w:jc w:val="center"/>
-            </w:pPr>
-            <w:r>
-              <w:t>75</w:t>
-            </w:r>
-          </w:p>
-        </w:tc>
-        <w:tc>
-          <w:tcPr>
-            <w:tcW w:type="dxa" w:w="2400"/>
-          </w:tcPr>
-          <w:p>
-            <w:pPr>
-              <w:pStyle w:val="TableParagraph"/>
-              <w:jc w:val="center"/>
-            </w:pPr>
-            <w:r>
-              <w:t>85</w:t>
-            </w:r>
-          </w:p>
-        </w:tc>
-        <w:tc>
-          <w:tcPr>
-            <w:tcW w:type="dxa" w:w="2400"/>
-          </w:tcPr>
-          <w:p>
-            <w:pPr>
-              <w:pStyle w:val="TableParagraph"/>
-              <w:jc w:val="center"/>
-            </w:pPr>
-            <w:r>
-              <w:t>152.5</w:t>
-            </w:r>
-          </w:p>
-        </w:tc>
-        <w:tc>
-          <w:tcPr>
-            <w:tcW w:type="dxa" w:w="2400"/>
-          </w:tcPr>
-          <w:p>
-            <w:pPr>
-              <w:pStyle w:val="TableParagraph"/>
-              <w:jc w:val="center"/>
-            </w:pPr>
-            <w:r>
-              <w:t>100</w:t>
-            </w:r>
-          </w:p>
-        </w:tc>
-      </w:tr>
-      <w:tr>
-        <w:tc>
-          <w:tcPr>
-            <w:tcW w:type="dxa" w:w="2400"/>
-          </w:tcPr>
-          <w:p>
-            <w:pPr>
-              <w:pStyle w:val="TableParagraph"/>
-              <w:jc w:val="center"/>
-            </w:pPr>
-            <w:r>
-              <w:t>100</w:t>
-            </w:r>
-          </w:p>
-        </w:tc>
-        <w:tc>
-          <w:tcPr>
-            <w:tcW w:type="dxa" w:w="2400"/>
-          </w:tcPr>
-          <w:p>
-            <w:pPr>
-              <w:pStyle w:val="TableParagraph"/>
-              <w:jc w:val="center"/>
-            </w:pPr>
-            <w:r>
-              <w:t>85</w:t>
-            </w:r>
-          </w:p>
-        </w:tc>
-        <w:tc>
-          <w:tcPr>
-            <w:tcW w:type="dxa" w:w="2400"/>
-          </w:tcPr>
-          <w:p>
-            <w:pPr>
-              <w:pStyle w:val="TableParagraph"/>
-              <w:jc w:val="center"/>
-            </w:pPr>
-            <w:r>
-              <w:t>134.2</w:t>
-            </w:r>
-          </w:p>
-        </w:tc>
-        <w:tc>
-          <w:tcPr>
-            <w:tcW w:type="dxa" w:w="2400"/>
-          </w:tcPr>
-          <w:p>
-            <w:pPr>
-              <w:pStyle w:val="TableParagraph"/>
-              <w:jc w:val="center"/>
-            </w:pPr>
-            <w:r>
-              <w:t>100</w:t>
+              <w:t>474,599</w:t>
             </w:r>
           </w:p>
         </w:tc>
@@ -2411,7 +2315,7 @@
         <w:jc w:val="center"/>
       </w:pPr>
       <w:r>
-        <w:t>Table 1. Empirical Target Allocation Benchmark Metrics Across Swarm Scale and RF Interference</w:t>
+        <w:t>Table 2. Aggregate Network Byte Overhead Across Protocol Architectures</w:t>
       </w:r>
     </w:p>
     <w:p>
@@ -2422,19 +2326,33 @@
         <w:pStyle w:val="Heading2"/>
       </w:pPr>
       <w:r>
-        <w:t>Analysis of Latency and Swarm Scaling</w:t>
-      </w:r>
-    </w:p>
-    <w:p>
-      <w:pPr/>
-      <w:r>
-        <w:t>As shown in Figure 5 and Table 1, the OpenClaw decentralized framework demonstrates remarkable latency efficiency as swarm scale increases. In a 50-node UAV swarm under 0% packet loss, consensus is reached in an average of 75.8ms. Crucially, when node density increases to 100 UAVs, consensus latency decreases to 70.8ms. This occurs because higher node density increases the spatial connectivity of the peer-to-peer mesh, shortening the hop distance required for gossip packets to propagate across the tactical sector.</w:t>
-      </w:r>
-    </w:p>
-    <w:p>
-      <w:pPr/>
-      <w:r>
-        <w:t>In contrast, a standard centralized C2 architecture exhibits logarithmic latency degradation as swarm scale grows due to central server bandwidth bottlenecks and multi-hop routing overheads, reaching over 345ms in 100-node swarms.</w:t>
+        <w:t>Resilience to Severe Electronic Warfare Jamming</w:t>
+      </w:r>
+    </w:p>
+    <w:p>
+      <w:pPr/>
+      <w:r>
+        <w:t>As shown in Table 1 and Table 2, the Gossip Protocol experiences immediate collapse under high RF drop rates, dropping from 96.6% state synchronization at 0% drop to 27.0% at 80% drop rate due to payload loss over uncompressed raw JSON matrices. Epidemic Routing maintains 90.9% state synchronization at 80% drop, but generates massive network congestion—transmitting 7,630,730 bytes (~7.63 MB) of flooding traffic.</w:t>
+      </w:r>
+    </w:p>
+    <w:p>
+      <w:pPr/>
+      <w:r>
+        <w:t>In contrast, the Agentic SLM Protocol achieves 91.6% global state synchronization and an 83.2% delivery success rate under 80% packet drop rate, while consuming only 474,599 bytes (~474 KB). This demonstrates that the proposed Agentic SLM architecture achieves equal or superior state synchronization compared to Epidemic Routing while providing a 16.1x reduction in total network byte overhead.</w:t>
+      </w:r>
+    </w:p>
+    <w:p>
+      <w:pPr>
+        <w:pStyle w:val="Heading1"/>
+      </w:pPr>
+      <w:r>
+        <w:t>Conclusion and Future Work</w:t>
+      </w:r>
+    </w:p>
+    <w:p>
+      <w:pPr/>
+      <w:r>
+        <w:t>This paper has presented a comprehensive system architecture and empirical validation for Agentic Swarm Coordination in D-DIL environments. By shifting the computational paradigm away from centralized command servers and toward Frugal Agentic AI using quantized semantic token representations and localized auction protocols on the edge, we established a resilient drone swarm orchestration mechanism. Our empirical simulation results demonstrate that the Agentic SLM Protocol achieves 91.6% state synchronization under 80% Electronic Warfare packet loss while reducing network byte consumption by 16.1x relative to Epidemic Routing paradigms.</w:t>
       </w:r>
     </w:p>
     <w:p>
@@ -2442,27 +2360,13 @@
         <w:pStyle w:val="Heading2"/>
       </w:pPr>
       <w:r>
-        <w:t>Resilience to Severe Electronic Warfare Jamming</w:t>
-      </w:r>
-    </w:p>
-    <w:p>
-      <w:pPr/>
-      <w:r>
-        <w:t>Under severe D-DIL conditions with 85% sustained packet loss, the OpenClaw framework maintains 100% target allocation convergence across all evaluated swarm sizes. In dense 100-node swarms under 85% RF jamming, mean target allocation latency remains tightly bounded at 134.2ms. This empirical finding validates our theoretical upper bound: because OpenClaw relies solely on localized heuristic consensus rather than unbroken multi-hop paths to a central server, localized mesh clusters independently allocate targets even when 85% of RF packets are destroyed by active jammers.</w:t>
-      </w:r>
-    </w:p>
-    <w:p>
-      <w:pPr>
-        <w:pStyle w:val="Heading2"/>
-      </w:pPr>
-      <w:r>
-        <w:t>Mitigation of Sub-Optimal Allocation and Overhead</w:t>
-      </w:r>
-    </w:p>
-    <w:p>
-      <w:pPr/>
-      <w:r>
-        <w:t>Our experimental evaluation confirmed that the proxy heuristic function H(Ni, Tj) delivers task allocations within 8.4% of global distance-path optimality while reducing total RF data transmission volume by 74.2% compared to continuous telemetry streaming required by centralized command structures. In kinetic D-DIL operational scenarios, the rapid execution of a slightly sub-optimal decentralized allocation far outweighs the precision of a centralized allocation that fails to arrive due to EW communication blackout.</w:t>
+        <w:t>Future Work</w:t>
+      </w:r>
+    </w:p>
+    <w:p>
+      <w:pPr/>
+      <w:r>
+        <w:t>Future research will focus on hardware-in-the-loop (HITL) flight testing, deploying the OpenClaw agentic engine onto physical Jetson Orin Nano edge modules mounted on quadrotors and subjecting them to live localized RF interference. Additionally, we will explore dynamic battery decay prediction models and non-stationary Gauss-Markov mobility topologies.</w:t>
       </w:r>
     </w:p>
     <w:p>
@@ -2470,52 +2374,30 @@
         <w:pStyle w:val="Heading1"/>
       </w:pPr>
       <w:r>
-        <w:t>Conclusion and Future Work</w:t>
-      </w:r>
-    </w:p>
-    <w:p>
-      <w:pPr/>
-      <w:r>
-        <w:t>This paper has presented a comprehensive system architecture and empirical validation for Agentic Swarm Coordination in D-DIL environments. By shifting the computational paradigm away from centralized command servers and toward Frugal Agentic AI using the OpenClaw framework on the edge, we established a resilient drone swarm orchestration mechanism. Our discrete-event network simulation results demonstrate that the decentralized auction protocol achieves 100% task allocation convergence under 85% Electronic Warfare packet loss while maintaining sub-150ms latency in dense swarms.</w:t>
-      </w:r>
-    </w:p>
-    <w:p>
-      <w:pPr>
-        <w:pStyle w:val="Heading2"/>
-      </w:pPr>
-      <w:r>
-        <w:t>Future Work</w:t>
-      </w:r>
-    </w:p>
-    <w:p>
-      <w:pPr/>
-      <w:r>
-        <w:t>Future research will focus on hardware-in-the-loop (HITL) flight testing, deploying the OpenClaw framework onto physical Jetson Orin Nano modules mounted on quadrotors and subjecting them to live localized RF interference. Additionally, we will explore integrating dynamic battery decay prediction models and adaptive multi-agent reinforcement learning into the heuristic engine to further optimize long-endurance swarm missions.</w:t>
-      </w:r>
-    </w:p>
-    <w:p>
-      <w:pPr>
-        <w:pStyle w:val="Heading1"/>
-      </w:pPr>
-      <w:r>
         <w:t>References</w:t>
       </w:r>
     </w:p>
     <w:p>
       <w:pPr/>
       <w:r>
+        <w:t>Bekmezci, I., Sahingoz, O. K., &amp; Temel, S. (2013). "Flying Ad-Hoc Networks (FANETs): A Survey," Ad Hoc Networks (11:3), pp. 1254-1270.</w:t>
+      </w:r>
+    </w:p>
+    <w:p>
+      <w:pPr/>
+      <w:r>
+        <w:t>Choi, H. L., Brunet, L., &amp; How, J. P. (2009). "Consensus-Based Decentralized Auctions for Robust Task Allocation," IEEE Transactions on Robotics (25:4), pp. 912-926.</w:t>
+      </w:r>
+    </w:p>
+    <w:p>
+      <w:pPr/>
+      <w:r>
         <w:t>Imteaj, A., Thakker, U., Wang, S., Li, J., &amp; Amini, M. H. (2022). "A Survey on Federated Learning for Resource-Constrained IoT Devices," IEEE Internet of Things Journal (9:1), pp. 4756-4789.</w:t>
       </w:r>
     </w:p>
     <w:p>
       <w:pPr/>
       <w:r>
-        <w:t>Junior, N. F., et al. (2025). "FedSensor: Federated Learning Framework for Secure Sensor-Based IoT at the Extreme Edge," IEEE Access (13), pp. 136940-136955.</w:t>
-      </w:r>
-    </w:p>
-    <w:p>
-      <w:pPr/>
-      <w:r>
         <w:t>Kairouz, P., et al. (2021). "Advances and Open Problems in Federated Learning," Foundations and Trends in Machine Learning (14:1-2), pp. 1-210.</w:t>
       </w:r>
     </w:p>
@@ -2528,7 +2410,19 @@
     <w:p>
       <w:pPr/>
       <w:r>
+        <w:t>Shi, W., Cao, J., Zhang, Q., Li, Y., &amp; Xu, L. (2016). "Edge Computing: Vision and Challenges," IEEE Internet of Things Journal (3:5), pp. 637-646.</w:t>
+      </w:r>
+    </w:p>
+    <w:p>
+      <w:pPr/>
+      <w:r>
         <w:t>Steinberger, P. (2026). "OpenClaw — Personal AI Assistant," GitHub Repository. Available: https://github.com/openclaw/openclaw</w:t>
+      </w:r>
+    </w:p>
+    <w:p>
+      <w:pPr/>
+      <w:r>
+        <w:t>Suri, N., Tortonesi, M., Michaelis, J., Budulas, P., Benincasa, G., Russell, S., Stefanelli, C., &amp; Winkler, R. (2016). "Analyzing the Applicability of Internet of Things to the Battlefield Environment," in Proceedings of the 2016 International Conference on Military Communications and Information Systems (ICMCIS), pp. 1-8.</w:t>
       </w:r>
     </w:p>
     <w:sectPr>

</xml_diff>